<commit_message>
ЛР46, ЛР49, ЛР81 documents updates
</commit_message>
<xml_diff>
--- a/ЛР49/звіт49.docx
+++ b/ЛР49/звіт49.docx
@@ -16,14 +16,7 @@
           <w:b/>
           <w:i/>
         </w:rPr>
-        <w:t>Звіт до лабораторної роботи №</w:t>
-      </w:r>
-      <w:r>
-        <w:rPr>
-          <w:b/>
-          <w:i/>
-        </w:rPr>
-        <w:t>49</w:t>
+        <w:t>Звіт до лабораторної роботи №49</w:t>
       </w:r>
     </w:p>
     <w:p/>
@@ -52,7 +45,13 @@
         <w:rPr>
           <w:i/>
         </w:rPr>
-        <w:t xml:space="preserve"> ФІО</w:t>
+        <w:t xml:space="preserve"> </w:t>
+      </w:r>
+      <w:r>
+        <w:rPr>
+          <w:i/>
+        </w:rPr>
+        <w:t>ПІБ</w:t>
       </w:r>
       <w:r>
         <w:rPr>
@@ -137,6 +136,7 @@
     <w:p>
       <w:pPr>
         <w:pStyle w:val="a3"/>
+        <w:jc w:val="left"/>
         <w:rPr>
           <w:i/>
         </w:rPr>
@@ -146,7 +146,14 @@
           <w:b/>
           <w:i/>
         </w:rPr>
-        <w:t>Мета:</w:t>
+        <w:t>Ціль роботи</w:t>
+      </w:r>
+      <w:r>
+        <w:rPr>
+          <w:b/>
+          <w:i/>
+        </w:rPr>
+        <w:t>:</w:t>
       </w:r>
       <w:r>
         <w:rPr>
@@ -345,10 +352,10 @@
             <v:path o:extrusionok="f" gradientshapeok="t" o:connecttype="rect"/>
             <o:lock v:ext="edit" aspectratio="t"/>
           </v:shapetype>
-          <v:shape id="_x0000_i1042" type="#_x0000_t75" style="width:77.25pt;height:37.15pt" o:ole="">
+          <v:shape id="_x0000_i1025" type="#_x0000_t75" style="width:77.4pt;height:37.2pt" o:ole="">
             <v:imagedata r:id="rId6" o:title=""/>
           </v:shape>
-          <o:OLEObject Type="Embed" ProgID="Equation.DSMT4" ShapeID="_x0000_i1042" DrawAspect="Content" ObjectID="_1755335567" r:id="rId7"/>
+          <o:OLEObject Type="Embed" ProgID="Equation.DSMT4" ShapeID="_x0000_i1025" DrawAspect="Content" ObjectID="_1825529149" r:id="rId7"/>
         </w:object>
       </w:r>
       <w:r>
@@ -372,10 +379,10 @@
           <w:szCs w:val="24"/>
         </w:rPr>
         <w:object w:dxaOrig="320" w:dyaOrig="360" w14:anchorId="6F16620A">
-          <v:shape id="_x0000_i1162" type="#_x0000_t75" style="width:16.15pt;height:18pt" o:ole="">
+          <v:shape id="_x0000_i1026" type="#_x0000_t75" style="width:16.2pt;height:18pt" o:ole="">
             <v:imagedata r:id="rId8" o:title=""/>
           </v:shape>
-          <o:OLEObject Type="Embed" ProgID="Equation.DSMT4" ShapeID="_x0000_i1162" DrawAspect="Content" ObjectID="_1755335568" r:id="rId9"/>
+          <o:OLEObject Type="Embed" ProgID="Equation.DSMT4" ShapeID="_x0000_i1026" DrawAspect="Content" ObjectID="_1825529150" r:id="rId9"/>
         </w:object>
       </w:r>
       <w:r>
@@ -409,10 +416,10 @@
           <w:position w:val="-10"/>
         </w:rPr>
         <w:object w:dxaOrig="940" w:dyaOrig="320" w14:anchorId="3149C7E7">
-          <v:shape id="_x0000_i1037" type="#_x0000_t75" style="width:46.9pt;height:15.75pt" o:ole="">
+          <v:shape id="_x0000_i1027" type="#_x0000_t75" style="width:46.8pt;height:15.6pt" o:ole="">
             <v:imagedata r:id="rId10" o:title=""/>
           </v:shape>
-          <o:OLEObject Type="Embed" ProgID="Equation.DSMT4" ShapeID="_x0000_i1037" DrawAspect="Content" ObjectID="_1755335569" r:id="rId11"/>
+          <o:OLEObject Type="Embed" ProgID="Equation.DSMT4" ShapeID="_x0000_i1027" DrawAspect="Content" ObjectID="_1825529151" r:id="rId11"/>
         </w:object>
       </w:r>
       <w:r>
@@ -465,10 +472,7 @@
         <w:t>ви</w:t>
       </w:r>
       <w:r>
-        <w:t>мірювальної котушки</w:t>
-      </w:r>
-      <w:r>
-        <w:t xml:space="preserve"> </w:t>
+        <w:t xml:space="preserve">мірювальної котушки </w:t>
       </w:r>
       <w:r>
         <w:rPr>
@@ -484,6 +488,220 @@
           <w:vertAlign w:val="superscript"/>
         </w:rPr>
         <w:t>2</w:t>
+      </w:r>
+      <w:r>
+        <w:t>.</w:t>
+      </w:r>
+    </w:p>
+    <w:p>
+      <w:pPr>
+        <w:ind w:firstLine="567"/>
+      </w:pPr>
+      <w:r>
+        <w:rPr>
+          <w:noProof/>
+        </w:rPr>
+        <mc:AlternateContent>
+          <mc:Choice Requires="wps">
+            <w:drawing>
+              <wp:anchor distT="0" distB="0" distL="114300" distR="114300" simplePos="0" relativeHeight="251659264" behindDoc="0" locked="0" layoutInCell="1" allowOverlap="1" wp14:anchorId="1B13409B" wp14:editId="73E8037B">
+                <wp:simplePos x="0" y="0"/>
+                <wp:positionH relativeFrom="column">
+                  <wp:posOffset>-117475</wp:posOffset>
+                </wp:positionH>
+                <wp:positionV relativeFrom="paragraph">
+                  <wp:posOffset>203835</wp:posOffset>
+                </wp:positionV>
+                <wp:extent cx="346710" cy="445770"/>
+                <wp:effectExtent l="19050" t="19050" r="53340" b="49530"/>
+                <wp:wrapNone/>
+                <wp:docPr id="2" name="Молния 2"/>
+                <wp:cNvGraphicFramePr/>
+                <a:graphic xmlns:a="http://schemas.openxmlformats.org/drawingml/2006/main">
+                  <a:graphicData uri="http://schemas.microsoft.com/office/word/2010/wordprocessingShape">
+                    <wps:wsp>
+                      <wps:cNvSpPr/>
+                      <wps:spPr>
+                        <a:xfrm>
+                          <a:off x="0" y="0"/>
+                          <a:ext cx="346710" cy="445770"/>
+                        </a:xfrm>
+                        <a:prstGeom prst="lightningBolt">
+                          <a:avLst/>
+                        </a:prstGeom>
+                      </wps:spPr>
+                      <wps:style>
+                        <a:lnRef idx="2">
+                          <a:schemeClr val="accent1">
+                            <a:shade val="50000"/>
+                          </a:schemeClr>
+                        </a:lnRef>
+                        <a:fillRef idx="1">
+                          <a:schemeClr val="accent1"/>
+                        </a:fillRef>
+                        <a:effectRef idx="0">
+                          <a:schemeClr val="accent1"/>
+                        </a:effectRef>
+                        <a:fontRef idx="minor">
+                          <a:schemeClr val="lt1"/>
+                        </a:fontRef>
+                      </wps:style>
+                      <wps:bodyPr rot="0" spcFirstLastPara="0" vertOverflow="overflow" horzOverflow="overflow" vert="horz" wrap="square" lIns="91440" tIns="45720" rIns="91440" bIns="45720" numCol="1" spcCol="0" rtlCol="0" fromWordArt="0" anchor="ctr" anchorCtr="0" forceAA="0" compatLnSpc="1">
+                        <a:prstTxWarp prst="textNoShape">
+                          <a:avLst/>
+                        </a:prstTxWarp>
+                        <a:noAutofit/>
+                      </wps:bodyPr>
+                    </wps:wsp>
+                  </a:graphicData>
+                </a:graphic>
+                <wp14:sizeRelH relativeFrom="margin">
+                  <wp14:pctWidth>0</wp14:pctWidth>
+                </wp14:sizeRelH>
+                <wp14:sizeRelV relativeFrom="margin">
+                  <wp14:pctHeight>0</wp14:pctHeight>
+                </wp14:sizeRelV>
+              </wp:anchor>
+            </w:drawing>
+          </mc:Choice>
+          <mc:Fallback>
+            <w:pict>
+              <v:shapetype w14:anchorId="302DB07D" id="_x0000_t73" coordsize="21600,21600" o:spt="73" path="m8472,l,3890,7602,8382,5022,9705r7200,4192l10012,14915r11588,6685l14767,12877r1810,-870l11050,6797r1810,-717xe">
+                <v:stroke joinstyle="miter"/>
+                <v:path o:connecttype="custom" o:connectlocs="8472,0;0,3890;5022,9705;10012,14915;21600,21600;16577,12007;12860,6080" o:connectangles="270,270,180,180,90,0,0" textboxrect="8757,7437,13917,14277"/>
+              </v:shapetype>
+              <v:shape id="Молния 2" o:spid="_x0000_s1026" type="#_x0000_t73" style="position:absolute;margin-left:-9.25pt;margin-top:16.05pt;width:27.3pt;height:35.1pt;z-index:251659264;visibility:visible;mso-wrap-style:square;mso-width-percent:0;mso-height-percent:0;mso-wrap-distance-left:9pt;mso-wrap-distance-top:0;mso-wrap-distance-right:9pt;mso-wrap-distance-bottom:0;mso-position-horizontal:absolute;mso-position-horizontal-relative:text;mso-position-vertical:absolute;mso-position-vertical-relative:text;mso-width-percent:0;mso-height-percent:0;mso-width-relative:margin;mso-height-relative:margin;v-text-anchor:middle" o:gfxdata="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" fillcolor="#4472c4 [3204]" strokecolor="#1f3763 [1604]" strokeweight="1pt"/>
+            </w:pict>
+          </mc:Fallback>
+        </mc:AlternateContent>
+      </w:r>
+    </w:p>
+    <w:p>
+      <w:pPr>
+        <w:ind w:left="567"/>
+        <w:rPr>
+          <w:i/>
+          <w:iCs/>
+          <w:color w:val="2E74B5" w:themeColor="accent5" w:themeShade="BF"/>
+          <w:szCs w:val="24"/>
+        </w:rPr>
+      </w:pPr>
+      <w:r>
+        <w:rPr>
+          <w:i/>
+          <w:iCs/>
+          <w:color w:val="2E74B5" w:themeColor="accent5" w:themeShade="BF"/>
+          <w:szCs w:val="24"/>
+        </w:rPr>
+        <w:t xml:space="preserve">Подивіться уважно на фото вольтметра та визначте ціну поділки </w:t>
+      </w:r>
+      <w:r>
+        <w:rPr>
+          <w:i/>
+          <w:iCs/>
+          <w:color w:val="2E74B5" w:themeColor="accent5" w:themeShade="BF"/>
+          <w:szCs w:val="24"/>
+        </w:rPr>
+        <w:t>вольтметра</w:t>
+      </w:r>
+      <w:r>
+        <w:rPr>
+          <w:i/>
+          <w:iCs/>
+          <w:color w:val="2E74B5" w:themeColor="accent5" w:themeShade="BF"/>
+          <w:szCs w:val="24"/>
+        </w:rPr>
+        <w:t xml:space="preserve">. </w:t>
+      </w:r>
+      <w:r>
+        <w:rPr>
+          <w:i/>
+          <w:iCs/>
+          <w:color w:val="2E74B5" w:themeColor="accent5" w:themeShade="BF"/>
+          <w:szCs w:val="24"/>
+        </w:rPr>
+        <w:t>Показання дивимось по верхній шкалі</w:t>
+      </w:r>
+      <w:r>
+        <w:rPr>
+          <w:i/>
+          <w:iCs/>
+          <w:color w:val="2E74B5" w:themeColor="accent5" w:themeShade="BF"/>
+          <w:szCs w:val="24"/>
+        </w:rPr>
+        <w:t xml:space="preserve"> та визначаємо по формулі  </w:t>
+      </w:r>
+      <w:r>
+        <w:rPr>
+          <w:i/>
+          <w:iCs/>
+          <w:color w:val="2E74B5" w:themeColor="accent5" w:themeShade="BF"/>
+          <w:position w:val="-12"/>
+          <w:szCs w:val="24"/>
+        </w:rPr>
+        <w:object w:dxaOrig="320" w:dyaOrig="360" w14:anchorId="17FA7869">
+          <v:shape id="_x0000_i1042" type="#_x0000_t75" style="width:16.2pt;height:18pt" o:ole="">
+            <v:imagedata r:id="rId8" o:title=""/>
+          </v:shape>
+          <o:OLEObject Type="Embed" ProgID="Equation.DSMT4" ShapeID="_x0000_i1042" DrawAspect="Content" ObjectID="_1825529152" r:id="rId12"/>
+        </w:object>
+      </w:r>
+      <w:r>
+        <w:rPr>
+          <w:i/>
+          <w:iCs/>
+          <w:color w:val="2E74B5" w:themeColor="accent5" w:themeShade="BF"/>
+          <w:szCs w:val="24"/>
+        </w:rPr>
+        <w:t xml:space="preserve">= С </w:t>
+      </w:r>
+      <w:r>
+        <w:rPr>
+          <w:i/>
+          <w:iCs/>
+          <w:color w:val="2E74B5" w:themeColor="accent5" w:themeShade="BF"/>
+          <w:szCs w:val="24"/>
+          <w:lang w:val="en-US"/>
+        </w:rPr>
+        <w:t>n</w:t>
+      </w:r>
+      <w:r>
+        <w:rPr>
+          <w:i/>
+          <w:iCs/>
+          <w:color w:val="2E74B5" w:themeColor="accent5" w:themeShade="BF"/>
+          <w:szCs w:val="24"/>
+        </w:rPr>
+        <w:t>, де</w:t>
+      </w:r>
+      <w:r>
+        <w:rPr>
+          <w:i/>
+          <w:iCs/>
+          <w:color w:val="2E74B5" w:themeColor="accent5" w:themeShade="BF"/>
+          <w:szCs w:val="24"/>
+          <w:lang w:val="ru-RU"/>
+        </w:rPr>
+        <w:t xml:space="preserve">  </w:t>
+      </w:r>
+      <w:r>
+        <w:rPr>
+          <w:i/>
+          <w:iCs/>
+          <w:color w:val="2E74B5" w:themeColor="accent5" w:themeShade="BF"/>
+          <w:szCs w:val="24"/>
+          <w:lang w:val="en-US"/>
+        </w:rPr>
+        <w:t>n</w:t>
+      </w:r>
+      <w:r>
+        <w:rPr>
+          <w:i/>
+          <w:iCs/>
+          <w:color w:val="2E74B5" w:themeColor="accent5" w:themeShade="BF"/>
+          <w:szCs w:val="24"/>
+        </w:rPr>
+        <w:t xml:space="preserve"> – кількість поділок, що показує стрілка вольтметру.</w:t>
       </w:r>
     </w:p>
     <w:p/>
@@ -518,10 +736,10 @@
           <w:position w:val="-36"/>
         </w:rPr>
         <w:object w:dxaOrig="1840" w:dyaOrig="780" w14:anchorId="4C34B753">
-          <v:shape id="_x0000_i1035" type="#_x0000_t75" style="width:97.15pt;height:41.25pt" o:ole="">
-            <v:imagedata r:id="rId12" o:title=""/>
+          <v:shape id="_x0000_i1028" type="#_x0000_t75" style="width:97.2pt;height:41.4pt" o:ole="">
+            <v:imagedata r:id="rId13" o:title=""/>
           </v:shape>
-          <o:OLEObject Type="Embed" ProgID="Equation.DSMT4" ShapeID="_x0000_i1035" DrawAspect="Content" ObjectID="_1755335570" r:id="rId13"/>
+          <o:OLEObject Type="Embed" ProgID="Equation.DSMT4" ShapeID="_x0000_i1028" DrawAspect="Content" ObjectID="_1825529153" r:id="rId14"/>
         </w:object>
       </w:r>
       <w:r>
@@ -571,6 +789,19 @@
       </w:r>
       <w:r>
         <w:t>індукція поля в центрі кругового струму</w:t>
+      </w:r>
+      <w:r>
+        <w:t xml:space="preserve"> (коли </w:t>
+      </w:r>
+      <w:r>
+        <w:rPr>
+          <w:i/>
+          <w:iCs/>
+        </w:rPr>
+        <w:t>х</w:t>
+      </w:r>
+      <w:r>
+        <w:t xml:space="preserve"> = 0)</w:t>
       </w:r>
     </w:p>
     <w:p>
@@ -688,7 +919,7 @@
         <w:gridCol w:w="1080"/>
         <w:gridCol w:w="1080"/>
         <w:gridCol w:w="1056"/>
-        <w:gridCol w:w="1376"/>
+        <w:gridCol w:w="1380"/>
         <w:gridCol w:w="1056"/>
       </w:tblGrid>
       <w:tr>
@@ -764,10 +995,10 @@
                 <w:szCs w:val="22"/>
               </w:rPr>
               <w:object w:dxaOrig="320" w:dyaOrig="360" w14:anchorId="1381BD23">
-                <v:shape id="_x0000_i1149" type="#_x0000_t75" style="width:16.15pt;height:18pt" o:ole="">
+                <v:shape id="_x0000_i1029" type="#_x0000_t75" style="width:16.2pt;height:18pt" o:ole="">
                   <v:imagedata r:id="rId8" o:title=""/>
                 </v:shape>
-                <o:OLEObject Type="Embed" ProgID="Equation.DSMT4" ShapeID="_x0000_i1149" DrawAspect="Content" ObjectID="_1755335571" r:id="rId14"/>
+                <o:OLEObject Type="Embed" ProgID="Equation.DSMT4" ShapeID="_x0000_i1029" DrawAspect="Content" ObjectID="_1825529154" r:id="rId15"/>
               </w:object>
             </w:r>
             <w:r>
@@ -814,10 +1045,10 @@
                 <w:szCs w:val="22"/>
               </w:rPr>
               <w:object w:dxaOrig="520" w:dyaOrig="360" w14:anchorId="7341B5CA">
-                <v:shape id="_x0000_i1150" type="#_x0000_t75" style="width:25.9pt;height:18pt" o:ole="">
-                  <v:imagedata r:id="rId15" o:title=""/>
+                <v:shape id="_x0000_i1030" type="#_x0000_t75" style="width:25.8pt;height:18pt" o:ole="">
+                  <v:imagedata r:id="rId16" o:title=""/>
                 </v:shape>
-                <o:OLEObject Type="Embed" ProgID="Equation.DSMT4" ShapeID="_x0000_i1150" DrawAspect="Content" ObjectID="_1755335572" r:id="rId16"/>
+                <o:OLEObject Type="Embed" ProgID="Equation.DSMT4" ShapeID="_x0000_i1030" DrawAspect="Content" ObjectID="_1825529155" r:id="rId17"/>
               </w:object>
             </w:r>
             <w:r>
@@ -864,10 +1095,10 @@
                 <w:szCs w:val="22"/>
               </w:rPr>
               <w:object w:dxaOrig="820" w:dyaOrig="360" w14:anchorId="3AE80191">
-                <v:shape id="_x0000_i1151" type="#_x0000_t75" style="width:40.9pt;height:18pt" o:ole="">
-                  <v:imagedata r:id="rId17" o:title=""/>
+                <v:shape id="_x0000_i1031" type="#_x0000_t75" style="width:40.8pt;height:18pt" o:ole="">
+                  <v:imagedata r:id="rId18" o:title=""/>
                 </v:shape>
-                <o:OLEObject Type="Embed" ProgID="Equation.DSMT4" ShapeID="_x0000_i1151" DrawAspect="Content" ObjectID="_1755335573" r:id="rId18"/>
+                <o:OLEObject Type="Embed" ProgID="Equation.DSMT4" ShapeID="_x0000_i1031" DrawAspect="Content" ObjectID="_1825529156" r:id="rId19"/>
               </w:object>
             </w:r>
           </w:p>
@@ -895,10 +1126,10 @@
                 <w:szCs w:val="22"/>
               </w:rPr>
               <w:object w:dxaOrig="1160" w:dyaOrig="780" w14:anchorId="1B909521">
-                <v:shape id="_x0000_i1152" type="#_x0000_t75" style="width:58.15pt;height:39pt" o:ole="">
-                  <v:imagedata r:id="rId19" o:title=""/>
+                <v:shape id="_x0000_i1032" type="#_x0000_t75" style="width:58.2pt;height:39pt" o:ole="">
+                  <v:imagedata r:id="rId20" o:title=""/>
                 </v:shape>
-                <o:OLEObject Type="Embed" ProgID="Equation.DSMT4" ShapeID="_x0000_i1152" DrawAspect="Content" ObjectID="_1755335574" r:id="rId20"/>
+                <o:OLEObject Type="Embed" ProgID="Equation.DSMT4" ShapeID="_x0000_i1032" DrawAspect="Content" ObjectID="_1825529157" r:id="rId21"/>
               </w:object>
             </w:r>
           </w:p>
@@ -926,10 +1157,10 @@
                 <w:szCs w:val="22"/>
               </w:rPr>
               <w:object w:dxaOrig="520" w:dyaOrig="320" w14:anchorId="6D983D83">
-                <v:shape id="_x0000_i1157" type="#_x0000_t75" style="width:25.9pt;height:16.15pt" o:ole="">
-                  <v:imagedata r:id="rId21" o:title=""/>
+                <v:shape id="_x0000_i1033" type="#_x0000_t75" style="width:25.8pt;height:16.2pt" o:ole="">
+                  <v:imagedata r:id="rId22" o:title=""/>
                 </v:shape>
-                <o:OLEObject Type="Embed" ProgID="Equation.DSMT4" ShapeID="_x0000_i1157" DrawAspect="Content" ObjectID="_1755335575" r:id="rId22"/>
+                <o:OLEObject Type="Embed" ProgID="Equation.DSMT4" ShapeID="_x0000_i1033" DrawAspect="Content" ObjectID="_1825529158" r:id="rId23"/>
               </w:object>
             </w:r>
             <w:r>
@@ -1952,6 +2183,7 @@
                 <w:sz w:val="22"/>
                 <w:szCs w:val="22"/>
               </w:rPr>
+              <w:lastRenderedPageBreak/>
               <w:t>6</w:t>
             </w:r>
           </w:p>
@@ -2626,10 +2858,10 @@
           <w:szCs w:val="22"/>
         </w:rPr>
         <w:object w:dxaOrig="820" w:dyaOrig="360" w14:anchorId="17E3B37D">
-          <v:shape id="_x0000_i1164" type="#_x0000_t75" style="width:40.9pt;height:18pt" o:ole="">
-            <v:imagedata r:id="rId17" o:title=""/>
+          <v:shape id="_x0000_i1034" type="#_x0000_t75" style="width:40.8pt;height:18pt" o:ole="">
+            <v:imagedata r:id="rId18" o:title=""/>
           </v:shape>
-          <o:OLEObject Type="Embed" ProgID="Equation.DSMT4" ShapeID="_x0000_i1164" DrawAspect="Content" ObjectID="_1755335576" r:id="rId23"/>
+          <o:OLEObject Type="Embed" ProgID="Equation.DSMT4" ShapeID="_x0000_i1034" DrawAspect="Content" ObjectID="_1825529159" r:id="rId24"/>
         </w:object>
       </w:r>
       <w:r>
@@ -2647,10 +2879,10 @@
           <w:szCs w:val="22"/>
         </w:rPr>
         <w:object w:dxaOrig="520" w:dyaOrig="320" w14:anchorId="6B48A590">
-          <v:shape id="_x0000_i1165" type="#_x0000_t75" style="width:25.9pt;height:16.15pt" o:ole="">
-            <v:imagedata r:id="rId21" o:title=""/>
+          <v:shape id="_x0000_i1035" type="#_x0000_t75" style="width:25.8pt;height:16.2pt" o:ole="">
+            <v:imagedata r:id="rId22" o:title=""/>
           </v:shape>
-          <o:OLEObject Type="Embed" ProgID="Equation.DSMT4" ShapeID="_x0000_i1165" DrawAspect="Content" ObjectID="_1755335577" r:id="rId24"/>
+          <o:OLEObject Type="Embed" ProgID="Equation.DSMT4" ShapeID="_x0000_i1035" DrawAspect="Content" ObjectID="_1825529160" r:id="rId25"/>
         </w:object>
       </w:r>
       <w:r>
@@ -2820,19 +3052,411 @@
     </w:p>
     <w:p>
       <w:pPr>
+        <w:rPr>
+          <w:i/>
+          <w:color w:val="0000FF"/>
+          <w:sz w:val="28"/>
+        </w:rPr>
+      </w:pPr>
+    </w:p>
+    <w:p>
+      <w:pPr>
+        <w:rPr>
+          <w:iCs/>
+          <w:sz w:val="28"/>
+        </w:rPr>
+      </w:pPr>
+      <w:r>
+        <w:rPr>
+          <w:iCs/>
+          <w:sz w:val="28"/>
+        </w:rPr>
+        <w:t>Відповіді на контрольні питання:</w:t>
+      </w:r>
+    </w:p>
+    <w:p>
+      <w:pPr>
+        <w:rPr>
+          <w:iCs/>
+          <w:sz w:val="28"/>
+        </w:rPr>
+      </w:pPr>
+    </w:p>
+    <w:p>
+      <w:pPr>
+        <w:pStyle w:val="a5"/>
+        <w:numPr>
+          <w:ilvl w:val="0"/>
+          <w:numId w:val="2"/>
+        </w:numPr>
+        <w:tabs>
+          <w:tab w:val="left" w:pos="851"/>
+        </w:tabs>
+        <w:spacing w:after="0"/>
+        <w:ind w:left="0" w:firstLine="567"/>
+        <w:jc w:val="both"/>
+        <w:rPr>
+          <w:sz w:val="28"/>
+          <w:szCs w:val="28"/>
+          <w:lang w:val="uk-UA"/>
+        </w:rPr>
+      </w:pPr>
+      <w:r>
+        <w:rPr>
+          <w:i/>
+          <w:sz w:val="28"/>
+          <w:szCs w:val="28"/>
+        </w:rPr>
+        <w:t xml:space="preserve"> </w:t>
+      </w:r>
+      <w:r>
+        <w:rPr>
+          <w:sz w:val="28"/>
+          <w:szCs w:val="28"/>
+          <w:lang w:val="uk-UA"/>
+        </w:rPr>
+        <w:t>Поясніть, яким чином можна створити магнітне поле в просторі і як його можна виявити?</w:t>
+      </w:r>
+    </w:p>
+    <w:p>
+      <w:pPr>
+        <w:pStyle w:val="a5"/>
+        <w:numPr>
+          <w:ilvl w:val="0"/>
+          <w:numId w:val="2"/>
+        </w:numPr>
+        <w:tabs>
+          <w:tab w:val="left" w:pos="851"/>
+        </w:tabs>
+        <w:spacing w:after="0"/>
+        <w:ind w:left="0" w:firstLine="567"/>
+        <w:jc w:val="both"/>
+        <w:rPr>
+          <w:sz w:val="28"/>
+          <w:szCs w:val="28"/>
+          <w:lang w:val="uk-UA"/>
+        </w:rPr>
+      </w:pPr>
+      <w:r>
+        <w:rPr>
+          <w:sz w:val="28"/>
+          <w:szCs w:val="28"/>
+          <w:lang w:val="uk-UA"/>
+        </w:rPr>
+        <w:t>Дайте визначення двох основних характеристик магнітного поля, запишіть зв'язок між ними.</w:t>
+      </w:r>
+    </w:p>
+    <w:p>
+      <w:pPr>
+        <w:pStyle w:val="a5"/>
+        <w:numPr>
+          <w:ilvl w:val="0"/>
+          <w:numId w:val="2"/>
+        </w:numPr>
+        <w:tabs>
+          <w:tab w:val="left" w:pos="851"/>
+        </w:tabs>
+        <w:spacing w:after="0"/>
+        <w:ind w:left="0" w:firstLine="567"/>
+        <w:jc w:val="both"/>
+        <w:rPr>
+          <w:sz w:val="28"/>
+          <w:szCs w:val="28"/>
+          <w:lang w:val="uk-UA"/>
+        </w:rPr>
+      </w:pPr>
+      <w:r>
+        <w:rPr>
+          <w:sz w:val="28"/>
+          <w:szCs w:val="28"/>
+          <w:lang w:val="uk-UA"/>
+        </w:rPr>
+        <w:t>Поясніть, як можна графічно зобразити розподіл магні</w:t>
+      </w:r>
+      <w:r>
+        <w:rPr>
+          <w:sz w:val="28"/>
+          <w:szCs w:val="28"/>
+          <w:lang w:val="uk-UA"/>
+        </w:rPr>
+        <w:t>т</w:t>
+      </w:r>
+      <w:r>
+        <w:rPr>
+          <w:sz w:val="28"/>
+          <w:szCs w:val="28"/>
+          <w:lang w:val="uk-UA"/>
+        </w:rPr>
+        <w:t>ного поля в просторі? Зобразіть магнітне поле кругового конт</w:t>
+      </w:r>
+      <w:r>
+        <w:rPr>
+          <w:sz w:val="28"/>
+          <w:szCs w:val="28"/>
+          <w:lang w:val="uk-UA"/>
+        </w:rPr>
+        <w:t>у</w:t>
+      </w:r>
+      <w:r>
+        <w:rPr>
+          <w:sz w:val="28"/>
+          <w:szCs w:val="28"/>
+          <w:lang w:val="uk-UA"/>
+        </w:rPr>
+        <w:t>ру зі струмом.</w:t>
+      </w:r>
+    </w:p>
+    <w:p>
+      <w:pPr>
+        <w:pStyle w:val="a5"/>
+        <w:numPr>
+          <w:ilvl w:val="0"/>
+          <w:numId w:val="2"/>
+        </w:numPr>
+        <w:tabs>
+          <w:tab w:val="left" w:pos="851"/>
+        </w:tabs>
+        <w:spacing w:after="0"/>
+        <w:ind w:left="0" w:firstLine="567"/>
+        <w:jc w:val="both"/>
+        <w:rPr>
+          <w:sz w:val="28"/>
+          <w:szCs w:val="28"/>
+          <w:lang w:val="uk-UA"/>
+        </w:rPr>
+      </w:pPr>
+      <w:r>
+        <w:rPr>
+          <w:sz w:val="28"/>
+          <w:szCs w:val="28"/>
+          <w:lang w:val="uk-UA"/>
+        </w:rPr>
+        <w:t xml:space="preserve">Запишіть закон </w:t>
+      </w:r>
+      <w:proofErr w:type="spellStart"/>
+      <w:r>
+        <w:rPr>
+          <w:sz w:val="28"/>
+          <w:szCs w:val="28"/>
+          <w:lang w:val="uk-UA"/>
+        </w:rPr>
+        <w:t>Біо</w:t>
+      </w:r>
+      <w:proofErr w:type="spellEnd"/>
+      <w:r>
+        <w:rPr>
+          <w:sz w:val="28"/>
+          <w:szCs w:val="28"/>
+          <w:lang w:val="uk-UA"/>
+        </w:rPr>
+        <w:t>-Савара-Лапласа в векторній і скалярній формах, поясніть закон рисунком. Що визначає цей з</w:t>
+      </w:r>
+      <w:r>
+        <w:rPr>
+          <w:sz w:val="28"/>
+          <w:szCs w:val="28"/>
+          <w:lang w:val="uk-UA"/>
+        </w:rPr>
+        <w:t>а</w:t>
+      </w:r>
+      <w:r>
+        <w:rPr>
+          <w:sz w:val="28"/>
+          <w:szCs w:val="28"/>
+          <w:lang w:val="uk-UA"/>
+        </w:rPr>
+        <w:t xml:space="preserve">кон? Як визначається напрямок </w:t>
+      </w:r>
+      <w:proofErr w:type="spellStart"/>
+      <w:r>
+        <w:rPr>
+          <w:sz w:val="28"/>
+          <w:szCs w:val="28"/>
+          <w:lang w:val="uk-UA"/>
+        </w:rPr>
+        <w:t>вектора</w:t>
+      </w:r>
+      <w:proofErr w:type="spellEnd"/>
+      <w:r>
+        <w:rPr>
+          <w:sz w:val="28"/>
+          <w:szCs w:val="28"/>
+          <w:lang w:val="uk-UA"/>
+        </w:rPr>
+        <w:t xml:space="preserve"> </w:t>
+      </w:r>
+      <w:r>
+        <w:rPr>
+          <w:position w:val="-6"/>
+          <w:sz w:val="28"/>
+          <w:szCs w:val="28"/>
+          <w:lang w:val="uk-UA"/>
+        </w:rPr>
+        <w:object w:dxaOrig="340" w:dyaOrig="340" w14:anchorId="39AAA763">
+          <v:shape id="_x0000_i1036" type="#_x0000_t75" style="width:16.8pt;height:16.8pt" o:ole="">
+            <v:imagedata r:id="rId26" o:title=""/>
+          </v:shape>
+          <o:OLEObject Type="Embed" ProgID="Equation.DSMT4" ShapeID="_x0000_i1036" DrawAspect="Content" ObjectID="_1825529161" r:id="rId27"/>
+        </w:object>
+      </w:r>
+      <w:r>
+        <w:rPr>
+          <w:sz w:val="28"/>
+          <w:szCs w:val="28"/>
+          <w:lang w:val="uk-UA"/>
+        </w:rPr>
+        <w:t>?</w:t>
+      </w:r>
+    </w:p>
+    <w:p>
+      <w:pPr>
+        <w:pStyle w:val="a5"/>
+        <w:numPr>
+          <w:ilvl w:val="0"/>
+          <w:numId w:val="2"/>
+        </w:numPr>
+        <w:tabs>
+          <w:tab w:val="left" w:pos="851"/>
+        </w:tabs>
+        <w:spacing w:after="0"/>
+        <w:ind w:left="0" w:firstLine="567"/>
+        <w:jc w:val="both"/>
+        <w:rPr>
+          <w:sz w:val="28"/>
+          <w:szCs w:val="28"/>
+          <w:lang w:val="uk-UA"/>
+        </w:rPr>
+      </w:pPr>
+      <w:r>
+        <w:rPr>
+          <w:sz w:val="28"/>
+          <w:szCs w:val="28"/>
+          <w:lang w:val="uk-UA"/>
+        </w:rPr>
+        <w:t xml:space="preserve">Використовуючи закон </w:t>
+      </w:r>
+      <w:proofErr w:type="spellStart"/>
+      <w:r>
+        <w:rPr>
+          <w:sz w:val="28"/>
+          <w:szCs w:val="28"/>
+          <w:lang w:val="uk-UA"/>
+        </w:rPr>
+        <w:t>Біо</w:t>
+      </w:r>
+      <w:proofErr w:type="spellEnd"/>
+      <w:r>
+        <w:rPr>
+          <w:sz w:val="28"/>
+          <w:szCs w:val="28"/>
+          <w:lang w:val="uk-UA"/>
+        </w:rPr>
+        <w:t>-Савара-Лапласа, виведіть формулу для визначення індукції поля на осі колового струму.</w:t>
+      </w:r>
+    </w:p>
+    <w:p>
+      <w:pPr>
+        <w:pStyle w:val="a5"/>
+        <w:numPr>
+          <w:ilvl w:val="0"/>
+          <w:numId w:val="2"/>
+        </w:numPr>
+        <w:tabs>
+          <w:tab w:val="left" w:pos="851"/>
+        </w:tabs>
+        <w:spacing w:after="0"/>
+        <w:ind w:left="0" w:firstLine="567"/>
+        <w:jc w:val="both"/>
+        <w:rPr>
+          <w:sz w:val="28"/>
+          <w:szCs w:val="28"/>
+          <w:lang w:val="uk-UA"/>
+        </w:rPr>
+      </w:pPr>
+      <w:r>
+        <w:rPr>
+          <w:sz w:val="28"/>
+          <w:szCs w:val="28"/>
+          <w:lang w:val="uk-UA"/>
+        </w:rPr>
+        <w:t>Запишіть і сформулюйте закон електромагнітної інду</w:t>
+      </w:r>
+      <w:r>
+        <w:rPr>
+          <w:sz w:val="28"/>
+          <w:szCs w:val="28"/>
+          <w:lang w:val="uk-UA"/>
+        </w:rPr>
+        <w:t>к</w:t>
+      </w:r>
+      <w:r>
+        <w:rPr>
+          <w:sz w:val="28"/>
+          <w:szCs w:val="28"/>
+          <w:lang w:val="uk-UA"/>
+        </w:rPr>
+        <w:t xml:space="preserve">ції Фарадея. Як визначається магнітний потік </w:t>
+      </w:r>
+      <w:r>
+        <w:rPr>
+          <w:position w:val="-4"/>
+          <w:sz w:val="28"/>
+          <w:szCs w:val="28"/>
+          <w:lang w:val="uk-UA"/>
+        </w:rPr>
+        <w:object w:dxaOrig="260" w:dyaOrig="260" w14:anchorId="62E44B4B">
+          <v:shape id="_x0000_i1037" type="#_x0000_t75" style="width:13.2pt;height:13.2pt" o:ole="">
+            <v:imagedata r:id="rId28" o:title=""/>
+          </v:shape>
+          <o:OLEObject Type="Embed" ProgID="Equation.DSMT4" ShapeID="_x0000_i1037" DrawAspect="Content" ObjectID="_1825529162" r:id="rId29"/>
+        </w:object>
+      </w:r>
+      <w:r>
+        <w:rPr>
+          <w:sz w:val="28"/>
+          <w:szCs w:val="28"/>
+          <w:lang w:val="uk-UA"/>
+        </w:rPr>
+        <w:t>?</w:t>
+      </w:r>
+    </w:p>
+    <w:p>
+      <w:pPr>
+        <w:pStyle w:val="HTML"/>
+        <w:numPr>
+          <w:ilvl w:val="0"/>
+          <w:numId w:val="2"/>
+        </w:numPr>
+        <w:tabs>
+          <w:tab w:val="clear" w:pos="720"/>
+          <w:tab w:val="num" w:pos="0"/>
+        </w:tabs>
+        <w:ind w:left="0" w:firstLine="600"/>
+        <w:jc w:val="both"/>
+        <w:rPr>
+          <w:rFonts w:ascii="Times New Roman" w:hAnsi="Times New Roman" w:cs="Times New Roman"/>
+          <w:sz w:val="28"/>
+          <w:szCs w:val="28"/>
+        </w:rPr>
+      </w:pPr>
+      <w:r>
+        <w:rPr>
+          <w:rFonts w:ascii="Times New Roman" w:hAnsi="Times New Roman" w:cs="Times New Roman"/>
+          <w:sz w:val="28"/>
+          <w:szCs w:val="28"/>
+          <w:lang w:val="uk-UA"/>
+        </w:rPr>
+        <w:t>Поясніть, як виконуються вимірювання в лабораторній роботі по малюнку установки зі звіту. Виведіть розрахункову формулу.</w:t>
+      </w:r>
+    </w:p>
+    <w:p>
+      <w:pPr>
         <w:ind w:firstLine="720"/>
         <w:rPr>
-          <w:i/>
-          <w:sz w:val="28"/>
-        </w:rPr>
-      </w:pPr>
-      <w:r>
-        <w:rPr>
-          <w:i/>
-          <w:sz w:val="28"/>
-        </w:rPr>
-        <w:t xml:space="preserve"> </w:t>
-      </w:r>
+          <w:iCs/>
+          <w:sz w:val="28"/>
+        </w:rPr>
+      </w:pPr>
     </w:p>
     <w:p>
       <w:pPr>
@@ -2972,8 +3596,100 @@
       </w:pPr>
     </w:lvl>
   </w:abstractNum>
+  <w:abstractNum w:abstractNumId="1" w15:restartNumberingAfterBreak="0">
+    <w:nsid w:val="6B3B04AC"/>
+    <w:multiLevelType w:val="hybridMultilevel"/>
+    <w:tmpl w:val="C0728932"/>
+    <w:lvl w:ilvl="0" w:tplc="0419000F">
+      <w:start w:val="1"/>
+      <w:numFmt w:val="decimal"/>
+      <w:lvlText w:val="%1."/>
+      <w:lvlJc w:val="left"/>
+      <w:pPr>
+        <w:tabs>
+          <w:tab w:val="num" w:pos="720"/>
+        </w:tabs>
+        <w:ind w:left="720" w:hanging="360"/>
+      </w:pPr>
+    </w:lvl>
+    <w:lvl w:ilvl="1" w:tplc="04190019" w:tentative="1">
+      <w:start w:val="1"/>
+      <w:numFmt w:val="lowerLetter"/>
+      <w:lvlText w:val="%2."/>
+      <w:lvlJc w:val="left"/>
+      <w:pPr>
+        <w:ind w:left="1440" w:hanging="360"/>
+      </w:pPr>
+    </w:lvl>
+    <w:lvl w:ilvl="2" w:tplc="0419001B" w:tentative="1">
+      <w:start w:val="1"/>
+      <w:numFmt w:val="lowerRoman"/>
+      <w:lvlText w:val="%3."/>
+      <w:lvlJc w:val="right"/>
+      <w:pPr>
+        <w:ind w:left="2160" w:hanging="180"/>
+      </w:pPr>
+    </w:lvl>
+    <w:lvl w:ilvl="3" w:tplc="0419000F" w:tentative="1">
+      <w:start w:val="1"/>
+      <w:numFmt w:val="decimal"/>
+      <w:lvlText w:val="%4."/>
+      <w:lvlJc w:val="left"/>
+      <w:pPr>
+        <w:ind w:left="2880" w:hanging="360"/>
+      </w:pPr>
+    </w:lvl>
+    <w:lvl w:ilvl="4" w:tplc="04190019" w:tentative="1">
+      <w:start w:val="1"/>
+      <w:numFmt w:val="lowerLetter"/>
+      <w:lvlText w:val="%5."/>
+      <w:lvlJc w:val="left"/>
+      <w:pPr>
+        <w:ind w:left="3600" w:hanging="360"/>
+      </w:pPr>
+    </w:lvl>
+    <w:lvl w:ilvl="5" w:tplc="0419001B" w:tentative="1">
+      <w:start w:val="1"/>
+      <w:numFmt w:val="lowerRoman"/>
+      <w:lvlText w:val="%6."/>
+      <w:lvlJc w:val="right"/>
+      <w:pPr>
+        <w:ind w:left="4320" w:hanging="180"/>
+      </w:pPr>
+    </w:lvl>
+    <w:lvl w:ilvl="6" w:tplc="0419000F" w:tentative="1">
+      <w:start w:val="1"/>
+      <w:numFmt w:val="decimal"/>
+      <w:lvlText w:val="%7."/>
+      <w:lvlJc w:val="left"/>
+      <w:pPr>
+        <w:ind w:left="5040" w:hanging="360"/>
+      </w:pPr>
+    </w:lvl>
+    <w:lvl w:ilvl="7" w:tplc="04190019" w:tentative="1">
+      <w:start w:val="1"/>
+      <w:numFmt w:val="lowerLetter"/>
+      <w:lvlText w:val="%8."/>
+      <w:lvlJc w:val="left"/>
+      <w:pPr>
+        <w:ind w:left="5760" w:hanging="360"/>
+      </w:pPr>
+    </w:lvl>
+    <w:lvl w:ilvl="8" w:tplc="0419001B" w:tentative="1">
+      <w:start w:val="1"/>
+      <w:numFmt w:val="lowerRoman"/>
+      <w:lvlText w:val="%9."/>
+      <w:lvlJc w:val="right"/>
+      <w:pPr>
+        <w:ind w:left="6480" w:hanging="180"/>
+      </w:pPr>
+    </w:lvl>
+  </w:abstractNum>
   <w:num w:numId="1">
     <w:abstractNumId w:val="0"/>
+  </w:num>
+  <w:num w:numId="2">
+    <w:abstractNumId w:val="1"/>
   </w:num>
 </w:numbering>
 </file>
@@ -3062,7 +3778,7 @@
     <w:lsdException w:name="Closing" w:semiHidden="1" w:unhideWhenUsed="1"/>
     <w:lsdException w:name="Signature" w:semiHidden="1" w:unhideWhenUsed="1"/>
     <w:lsdException w:name="Default Paragraph Font" w:semiHidden="1" w:uiPriority="1" w:unhideWhenUsed="1"/>
-    <w:lsdException w:name="Body Text" w:semiHidden="1" w:unhideWhenUsed="1"/>
+    <w:lsdException w:name="Body Text" w:semiHidden="1" w:uiPriority="0" w:unhideWhenUsed="1"/>
     <w:lsdException w:name="Body Text Indent" w:semiHidden="1" w:uiPriority="0" w:unhideWhenUsed="1"/>
     <w:lsdException w:name="List Continue" w:semiHidden="1" w:unhideWhenUsed="1"/>
     <w:lsdException w:name="List Continue 2" w:semiHidden="1" w:unhideWhenUsed="1"/>
@@ -3097,7 +3813,7 @@
     <w:lsdException w:name="HTML Code" w:semiHidden="1" w:unhideWhenUsed="1"/>
     <w:lsdException w:name="HTML Definition" w:semiHidden="1" w:unhideWhenUsed="1"/>
     <w:lsdException w:name="HTML Keyboard" w:semiHidden="1" w:unhideWhenUsed="1"/>
-    <w:lsdException w:name="HTML Preformatted" w:semiHidden="1" w:unhideWhenUsed="1"/>
+    <w:lsdException w:name="HTML Preformatted" w:semiHidden="1" w:uiPriority="0" w:unhideWhenUsed="1"/>
     <w:lsdException w:name="HTML Sample" w:semiHidden="1" w:unhideWhenUsed="1"/>
     <w:lsdException w:name="HTML Typewriter" w:semiHidden="1" w:unhideWhenUsed="1"/>
     <w:lsdException w:name="HTML Variable" w:semiHidden="1" w:unhideWhenUsed="1"/>
@@ -3549,6 +4265,74 @@
       <w:lang w:val="uk-UA" w:eastAsia="ru-RU"/>
     </w:rPr>
   </w:style>
+  <w:style w:type="paragraph" w:styleId="a5">
+    <w:name w:val="Body Text"/>
+    <w:basedOn w:val="a"/>
+    <w:link w:val="a6"/>
+    <w:rsid w:val="00E62B46"/>
+    <w:pPr>
+      <w:spacing w:after="120"/>
+    </w:pPr>
+    <w:rPr>
+      <w:szCs w:val="24"/>
+      <w:lang w:val="ru-RU"/>
+    </w:rPr>
+  </w:style>
+  <w:style w:type="character" w:customStyle="1" w:styleId="a6">
+    <w:name w:val="Основной текст Знак"/>
+    <w:basedOn w:val="a0"/>
+    <w:link w:val="a5"/>
+    <w:rsid w:val="00E62B46"/>
+    <w:rPr>
+      <w:rFonts w:ascii="Times New Roman" w:eastAsia="Times New Roman" w:hAnsi="Times New Roman" w:cs="Times New Roman"/>
+      <w:sz w:val="24"/>
+      <w:szCs w:val="24"/>
+      <w:lang w:val="ru-RU" w:eastAsia="ru-RU"/>
+    </w:rPr>
+  </w:style>
+  <w:style w:type="paragraph" w:styleId="HTML">
+    <w:name w:val="HTML Preformatted"/>
+    <w:basedOn w:val="a"/>
+    <w:link w:val="HTML0"/>
+    <w:rsid w:val="00E62B46"/>
+    <w:pPr>
+      <w:tabs>
+        <w:tab w:val="left" w:pos="916"/>
+        <w:tab w:val="left" w:pos="1832"/>
+        <w:tab w:val="left" w:pos="2748"/>
+        <w:tab w:val="left" w:pos="3664"/>
+        <w:tab w:val="left" w:pos="4580"/>
+        <w:tab w:val="left" w:pos="5496"/>
+        <w:tab w:val="left" w:pos="6412"/>
+        <w:tab w:val="left" w:pos="7328"/>
+        <w:tab w:val="left" w:pos="8244"/>
+        <w:tab w:val="left" w:pos="9160"/>
+        <w:tab w:val="left" w:pos="10076"/>
+        <w:tab w:val="left" w:pos="10992"/>
+        <w:tab w:val="left" w:pos="11908"/>
+        <w:tab w:val="left" w:pos="12824"/>
+        <w:tab w:val="left" w:pos="13740"/>
+        <w:tab w:val="left" w:pos="14656"/>
+      </w:tabs>
+    </w:pPr>
+    <w:rPr>
+      <w:rFonts w:ascii="Courier New" w:hAnsi="Courier New" w:cs="Courier New"/>
+      <w:sz w:val="20"/>
+      <w:lang w:val="ru-RU"/>
+    </w:rPr>
+  </w:style>
+  <w:style w:type="character" w:customStyle="1" w:styleId="HTML0">
+    <w:name w:val="Стандартный HTML Знак"/>
+    <w:basedOn w:val="a0"/>
+    <w:link w:val="HTML"/>
+    <w:rsid w:val="00E62B46"/>
+    <w:rPr>
+      <w:rFonts w:ascii="Courier New" w:eastAsia="Times New Roman" w:hAnsi="Courier New" w:cs="Courier New"/>
+      <w:sz w:val="20"/>
+      <w:szCs w:val="20"/>
+      <w:lang w:val="ru-RU" w:eastAsia="ru-RU"/>
+    </w:rPr>
+  </w:style>
 </w:styles>
 </file>
 

</xml_diff>